<commit_message>
refactorizacion de nombres de clases
</commit_message>
<xml_diff>
--- a/docs/Informe_Pruebas_JUnit.docx
+++ b/docs/Informe_Pruebas_JUnit.docx
@@ -308,7 +308,11 @@
           <w:tcPr>
             <w:tcW w:w="0" w:type="auto"/>
           </w:tcPr>
-          <w:p/>
+          <w:p>
+            <w:r>
+              <w:t>Pedro Yañez Haumada</w:t>
+            </w:r>
+          </w:p>
         </w:tc>
       </w:tr>
       <w:tr>
@@ -499,7 +503,23 @@
     <w:p/>
     <w:p>
       <w:r>
-        <w:t xml:space="preserve">En esta evaluación solo se implementaron test unitarios  sobre  la clase de utilidades Heramientas, la cual es la “biblioteca” principal para construir las otras clases. Para algunos métodos especificos, centrar() por ejemplo, se probaron hasta 3 test </w:t>
+        <w:t xml:space="preserve">En esta evaluación solo se implementaron test </w:t>
+      </w:r>
+      <w:proofErr w:type="gramStart"/>
+      <w:r>
+        <w:t>unitarios  sobre</w:t>
+      </w:r>
+      <w:proofErr w:type="gramEnd"/>
+      <w:r>
+        <w:t xml:space="preserve">  la clase de utilidades Heramientas, la cual es la “biblioteca” principal para construir las otras clases. Para algunos métodos especificos, </w:t>
+      </w:r>
+      <w:proofErr w:type="gramStart"/>
+      <w:r>
+        <w:t>centrar(</w:t>
+      </w:r>
+      <w:proofErr w:type="gramEnd"/>
+      <w:r>
+        <w:t xml:space="preserve">) por ejemplo, se probaron hasta 3 test </w:t>
       </w:r>
       <w:proofErr w:type="spellStart"/>
       <w:r>
@@ -550,7 +570,23 @@
       </w:r>
       <w:proofErr w:type="spellEnd"/>
       <w:r>
-        <w:t xml:space="preserve"> casos de uso.</w:t>
+        <w:t xml:space="preserve"> </w:t>
+      </w:r>
+      <w:proofErr w:type="spellStart"/>
+      <w:r>
+        <w:t>casos</w:t>
+      </w:r>
+      <w:proofErr w:type="spellEnd"/>
+      <w:r>
+        <w:t xml:space="preserve"> de </w:t>
+      </w:r>
+      <w:proofErr w:type="spellStart"/>
+      <w:r>
+        <w:t>uso</w:t>
+      </w:r>
+      <w:proofErr w:type="spellEnd"/>
+      <w:r>
+        <w:t>.</w:t>
       </w:r>
     </w:p>
     <w:tbl>
@@ -591,8 +627,13 @@
             <w:tcW w:w="4320" w:type="dxa"/>
           </w:tcPr>
           <w:p>
+            <w:proofErr w:type="gramStart"/>
             <w:r>
-              <w:t>centrar()</w:t>
+              <w:t>centrar(</w:t>
+            </w:r>
+            <w:proofErr w:type="gramEnd"/>
+            <w:r>
+              <w:t>)</w:t>
             </w:r>
           </w:p>
         </w:tc>
@@ -613,8 +654,13 @@
             <w:tcW w:w="4320" w:type="dxa"/>
           </w:tcPr>
           <w:p>
+            <w:proofErr w:type="gramStart"/>
             <w:r>
-              <w:t>titulo()</w:t>
+              <w:t>titulo(</w:t>
+            </w:r>
+            <w:proofErr w:type="gramEnd"/>
+            <w:r>
+              <w:t>)</w:t>
             </w:r>
           </w:p>
         </w:tc>
@@ -635,8 +681,13 @@
             <w:tcW w:w="4320" w:type="dxa"/>
           </w:tcPr>
           <w:p>
+            <w:proofErr w:type="gramStart"/>
             <w:r>
-              <w:t>cleanerscreen()</w:t>
+              <w:t>cleanerscreen(</w:t>
+            </w:r>
+            <w:proofErr w:type="gramEnd"/>
+            <w:r>
+              <w:t>)</w:t>
             </w:r>
           </w:p>
         </w:tc>
@@ -657,8 +708,13 @@
             <w:tcW w:w="4320" w:type="dxa"/>
           </w:tcPr>
           <w:p>
+            <w:proofErr w:type="gramStart"/>
             <w:r>
-              <w:t>depositar()</w:t>
+              <w:t>depositar(</w:t>
+            </w:r>
+            <w:proofErr w:type="gramEnd"/>
+            <w:r>
+              <w:t>)</w:t>
             </w:r>
           </w:p>
         </w:tc>
@@ -679,8 +735,13 @@
             <w:tcW w:w="4320" w:type="dxa"/>
           </w:tcPr>
           <w:p>
+            <w:proofErr w:type="gramStart"/>
             <w:r>
-              <w:t>retirar()</w:t>
+              <w:t>retirar(</w:t>
+            </w:r>
+            <w:proofErr w:type="gramEnd"/>
+            <w:r>
+              <w:t>)</w:t>
             </w:r>
           </w:p>
         </w:tc>
@@ -701,8 +762,13 @@
             <w:tcW w:w="4320" w:type="dxa"/>
           </w:tcPr>
           <w:p>
+            <w:proofErr w:type="gramStart"/>
             <w:r>
-              <w:t>convertDivisa()</w:t>
+              <w:t>convertDivisa(</w:t>
+            </w:r>
+            <w:proofErr w:type="gramEnd"/>
+            <w:r>
+              <w:t>)</w:t>
             </w:r>
           </w:p>
         </w:tc>
@@ -723,8 +789,13 @@
             <w:tcW w:w="4320" w:type="dxa"/>
           </w:tcPr>
           <w:p>
+            <w:proofErr w:type="gramStart"/>
             <w:r>
-              <w:t>Cuenta() y numeración automática</w:t>
+              <w:t>Cuenta(</w:t>
+            </w:r>
+            <w:proofErr w:type="gramEnd"/>
+            <w:r>
+              <w:t>) y numeración automática</w:t>
             </w:r>
           </w:p>
         </w:tc>
@@ -746,12 +817,17 @@
           </w:tcPr>
           <w:p>
             <w:proofErr w:type="spellStart"/>
+            <w:proofErr w:type="gramStart"/>
             <w:r>
               <w:t>MostarCuenta</w:t>
             </w:r>
             <w:proofErr w:type="spellEnd"/>
             <w:r>
-              <w:t>()</w:t>
+              <w:t>(</w:t>
+            </w:r>
+            <w:proofErr w:type="gramEnd"/>
+            <w:r>
+              <w:t>)</w:t>
             </w:r>
           </w:p>
         </w:tc>
@@ -1163,7 +1239,23 @@
           <w:b/>
           <w:bCs/>
         </w:rPr>
-        <w:t xml:space="preserve">62,5 %  de la </w:t>
+        <w:t xml:space="preserve">62,5 </w:t>
+      </w:r>
+      <w:proofErr w:type="gramStart"/>
+      <w:r>
+        <w:rPr>
+          <w:b/>
+          <w:bCs/>
+        </w:rPr>
+        <w:t>%  de</w:t>
+      </w:r>
+      <w:proofErr w:type="gramEnd"/>
+      <w:r>
+        <w:rPr>
+          <w:b/>
+          <w:bCs/>
+        </w:rPr>
+        <w:t xml:space="preserve"> la </w:t>
       </w:r>
       <w:proofErr w:type="spellStart"/>
       <w:r>
@@ -1198,11 +1290,16 @@
       <w:r>
         <w:t xml:space="preserve"> </w:t>
       </w:r>
+      <w:proofErr w:type="gramStart"/>
       <w:r>
         <w:t xml:space="preserve">El </w:t>
       </w:r>
       <w:r>
-        <w:t xml:space="preserve"> proceso permitió reforzar el </w:t>
+        <w:t xml:space="preserve"> proceso</w:t>
+      </w:r>
+      <w:proofErr w:type="gramEnd"/>
+      <w:r>
+        <w:t xml:space="preserve"> permitió reforzar el </w:t>
       </w:r>
       <w:r>
         <w:rPr>
@@ -1365,7 +1462,23 @@
           <w:b/>
           <w:bCs/>
         </w:rPr>
-        <w:t xml:space="preserve">Anexo 2 : Coverage del test </w:t>
+        <w:t xml:space="preserve">Anexo </w:t>
+      </w:r>
+      <w:proofErr w:type="gramStart"/>
+      <w:r>
+        <w:rPr>
+          <w:b/>
+          <w:bCs/>
+        </w:rPr>
+        <w:t>2 :</w:t>
+      </w:r>
+      <w:proofErr w:type="gramEnd"/>
+      <w:r>
+        <w:rPr>
+          <w:b/>
+          <w:bCs/>
+        </w:rPr>
+        <w:t xml:space="preserve"> Coverage del test </w:t>
       </w:r>
       <w:proofErr w:type="spellStart"/>
       <w:r>

</xml_diff>